<commit_message>
fix(contratos): alinear linea de firma de coberturas plurales con el patron Firma:
Los templates plurales usaban f)___ y el patron de firma cambio a Firma:___,
por lo que Documenso/WeeTrust caian a coordenadas por defecto en plural.

Co-Authored-By: Claude Fable 5 <noreply@anthropic.com>
</commit_message>
<xml_diff>
--- a/apps/legal-docs-blueprints/templates/cobertura_inrexsa/CARTA_COBERTURA_PLACAS_COMERCIALES_PLURAL.docx
+++ b/apps/legal-docs-blueprints/templates/cobertura_inrexsa/CARTA_COBERTURA_PLACAS_COMERCIALES_PLURAL.docx
@@ -3193,8 +3193,8 @@
         </w:tblCellMar>
       </w:tblPr>
       <w:tblGrid>
-        <w:gridCol w:w="4131"/>
-        <w:gridCol w:w="5057"/>
+        <w:gridCol w:w="4130"/>
+        <w:gridCol w:w="5058"/>
       </w:tblGrid>
       <w:tr>
         <w:trPr>
@@ -3202,7 +3202,7 @@
         </w:trPr>
         <w:tc>
           <w:tcPr>
-            <w:tcW w:w="4131" w:type="dxa"/>
+            <w:tcW w:w="4130" w:type="dxa"/>
             <w:tcBorders/>
           </w:tcPr>
           <w:p>
@@ -3226,7 +3226,14 @@
                 <w:rFonts w:ascii="Arial" w:hAnsi="Arial"/>
                 <w:sz w:val="20"/>
               </w:rPr>
-              <w:t>f)_______________________</w:t>
+              <w:t>Firma:</w:t>
+            </w:r>
+            <w:r>
+              <w:rPr>
+                <w:rFonts w:ascii="Arial" w:hAnsi="Arial"/>
+                <w:sz w:val="20"/>
+              </w:rPr>
+              <w:t>_______________________</w:t>
             </w:r>
           </w:p>
           <w:p>
@@ -3243,7 +3250,7 @@
         </w:tc>
         <w:tc>
           <w:tcPr>
-            <w:tcW w:w="5057" w:type="dxa"/>
+            <w:tcW w:w="5058" w:type="dxa"/>
             <w:tcBorders/>
           </w:tcPr>
           <w:p>
@@ -3277,7 +3284,14 @@
                 <w:rFonts w:ascii="Arial" w:hAnsi="Arial"/>
                 <w:sz w:val="20"/>
               </w:rPr>
-              <w:t>f)________________________</w:t>
+              <w:t>Firma:</w:t>
+            </w:r>
+            <w:r>
+              <w:rPr>
+                <w:rFonts w:ascii="Arial" w:hAnsi="Arial"/>
+                <w:sz w:val="20"/>
+              </w:rPr>
+              <w:t>________________________</w:t>
             </w:r>
           </w:p>
           <w:p>
@@ -7943,8 +7957,8 @@
         </w:tblCellMar>
       </w:tblPr>
       <w:tblGrid>
-        <w:gridCol w:w="4131"/>
-        <w:gridCol w:w="5057"/>
+        <w:gridCol w:w="4130"/>
+        <w:gridCol w:w="5058"/>
       </w:tblGrid>
       <w:tr>
         <w:trPr>
@@ -7952,7 +7966,7 @@
         </w:trPr>
         <w:tc>
           <w:tcPr>
-            <w:tcW w:w="4131" w:type="dxa"/>
+            <w:tcW w:w="4130" w:type="dxa"/>
             <w:tcBorders/>
           </w:tcPr>
           <w:p>
@@ -7976,7 +7990,14 @@
                 <w:rFonts w:ascii="Arial" w:hAnsi="Arial"/>
                 <w:sz w:val="20"/>
               </w:rPr>
-              <w:t>f)_______________________</w:t>
+              <w:t>Firma:</w:t>
+            </w:r>
+            <w:r>
+              <w:rPr>
+                <w:rFonts w:ascii="Arial" w:hAnsi="Arial"/>
+                <w:sz w:val="20"/>
+              </w:rPr>
+              <w:t>_______________________</w:t>
             </w:r>
           </w:p>
           <w:p>
@@ -7993,7 +8014,7 @@
         </w:tc>
         <w:tc>
           <w:tcPr>
-            <w:tcW w:w="5057" w:type="dxa"/>
+            <w:tcW w:w="5058" w:type="dxa"/>
             <w:tcBorders/>
           </w:tcPr>
           <w:p>
@@ -8027,7 +8048,14 @@
                 <w:rFonts w:ascii="Arial" w:hAnsi="Arial"/>
                 <w:sz w:val="20"/>
               </w:rPr>
-              <w:t>f)________________________</w:t>
+              <w:t>Firma:</w:t>
+            </w:r>
+            <w:r>
+              <w:rPr>
+                <w:rFonts w:ascii="Arial" w:hAnsi="Arial"/>
+                <w:sz w:val="20"/>
+              </w:rPr>
+              <w:t>________________________</w:t>
             </w:r>
           </w:p>
           <w:p>
@@ -10024,15 +10052,15 @@
       <w14:ligatures w14:val="none"/>
     </w:rPr>
   </w:style>
-  <w:style w:type="paragraph" w:styleId="Cabeceraypie">
-    <w:name w:val="Cabecera y pie"/>
+  <w:style w:type="paragraph" w:styleId="Cabeceraypieuser">
+    <w:name w:val="Cabecera y pie (user)"/>
     <w:basedOn w:val="Normal"/>
     <w:qFormat/>
     <w:pPr/>
     <w:rPr/>
   </w:style>
-  <w:style w:type="paragraph" w:styleId="Cabeceraypieuser">
-    <w:name w:val="Cabecera y pie (user)"/>
+  <w:style w:type="paragraph" w:styleId="Cabeceraypie">
+    <w:name w:val="Cabecera y pie"/>
     <w:basedOn w:val="Normal"/>
     <w:qFormat/>
     <w:pPr/>
@@ -10072,8 +10100,8 @@
     </w:pPr>
     <w:rPr/>
   </w:style>
-  <w:style w:type="numbering" w:styleId="Ningunalista" w:default="1">
-    <w:name w:val="Ninguna lista"/>
+  <w:style w:type="numbering" w:styleId="Ningunalistauser" w:default="1">
+    <w:name w:val="Ninguna lista (user)"/>
     <w:uiPriority w:val="99"/>
     <w:semiHidden/>
     <w:unhideWhenUsed/>

</xml_diff>